<commit_message>
them danh gia hieu suat cua phan
</commit_message>
<xml_diff>
--- a/Định nghĩa các khái niệm, ss khóa ,không khóa (HDH).docx
+++ b/Định nghĩa các khái niệm, ss khóa ,không khóa (HDH).docx
@@ -705,27 +705,7 @@
           <w:sz w:val="28"/>
           <w:szCs w:val="28"/>
         </w:rPr>
-        <w:t xml:space="preserve">Trường hợp </w:t>
-      </w:r>
-      <w:r>
-        <w:rPr>
-          <w:rFonts w:ascii="Times New Roman" w:hAnsi="Times New Roman" w:cs="Times New Roman"/>
-          <w:b/>
-          <w:bCs/>
-          <w:sz w:val="28"/>
-          <w:szCs w:val="28"/>
-        </w:rPr>
-        <w:t>không</w:t>
-      </w:r>
-      <w:r>
-        <w:rPr>
-          <w:rFonts w:ascii="Times New Roman" w:hAnsi="Times New Roman" w:cs="Times New Roman"/>
-          <w:b/>
-          <w:bCs/>
-          <w:sz w:val="28"/>
-          <w:szCs w:val="28"/>
-        </w:rPr>
-        <w:t xml:space="preserve"> dùng khóa:</w:t>
+        <w:t>Trường hợp không dùng khóa:</w:t>
       </w:r>
     </w:p>
     <w:p>
@@ -1085,6 +1065,7 @@
           <w:rFonts w:ascii="Times New Roman" w:hAnsi="Times New Roman" w:cs="Times New Roman"/>
           <w:sz w:val="28"/>
           <w:szCs w:val="28"/>
+          <w:lang w:val="vi-VN"/>
         </w:rPr>
       </w:pPr>
       <w:r>
@@ -1115,6 +1096,326 @@
         </w:rPr>
         <w:t xml:space="preserve"> Giải pháp này yêu cầu cơ chế bận thì đợi (busy waiting), gây lãng phí tài nguyên CPU trong lúc tiến trình đứng chờ. Nếu hệ thống phức tạp và thao tác khóa/mở khóa không được thiết kế chuẩn xác, nó sẽ trở thành nguyên nhân sinh ra các lỗi tắc nghẽn (deadlock) và làm suy giảm hiệu năng tổng thể.</w:t>
       </w:r>
+    </w:p>
+    <w:p>
+      <w:pPr>
+        <w:jc w:val="both"/>
+        <w:rPr>
+          <w:rFonts w:ascii="Times New Roman" w:hAnsi="Times New Roman" w:cs="Times New Roman"/>
+          <w:sz w:val="28"/>
+          <w:szCs w:val="28"/>
+          <w:lang w:val="vi-VN"/>
+        </w:rPr>
+      </w:pPr>
+    </w:p>
+    <w:p>
+      <w:pPr>
+        <w:jc w:val="both"/>
+        <w:rPr>
+          <w:rFonts w:ascii="Times New Roman" w:hAnsi="Times New Roman" w:cs="Times New Roman"/>
+          <w:b/>
+          <w:bCs/>
+          <w:sz w:val="28"/>
+          <w:szCs w:val="28"/>
+          <w:lang w:val="vi-VN"/>
+        </w:rPr>
+      </w:pPr>
+      <w:r>
+        <w:rPr>
+          <w:rFonts w:ascii="Times New Roman" w:hAnsi="Times New Roman" w:cs="Times New Roman"/>
+          <w:b/>
+          <w:bCs/>
+          <w:sz w:val="28"/>
+          <w:szCs w:val="28"/>
+          <w:lang w:val="vi-VN"/>
+        </w:rPr>
+        <w:t>4.1. Đánh giá kết quả mô phỏng</w:t>
+      </w:r>
+    </w:p>
+    <w:p>
+      <w:pPr>
+        <w:jc w:val="both"/>
+        <w:rPr>
+          <w:rFonts w:ascii="Times New Roman" w:hAnsi="Times New Roman" w:cs="Times New Roman"/>
+          <w:sz w:val="28"/>
+          <w:szCs w:val="28"/>
+          <w:lang w:val="vi-VN"/>
+        </w:rPr>
+      </w:pPr>
+      <w:r>
+        <w:rPr>
+          <w:rFonts w:ascii="Times New Roman" w:hAnsi="Times New Roman" w:cs="Times New Roman"/>
+          <w:sz w:val="28"/>
+          <w:szCs w:val="28"/>
+          <w:lang w:val="vi-VN"/>
+        </w:rPr>
+        <w:t>Thông qua việc xây dựng ứng dụng mô phỏng bằng C# (mô hình WPF/MVVM), nhóm đã tái hiện thành công hiện tượng Race Condition (tranh đoạt điều khiển) và cơ chế khắc phục bằng khóa loại trừ (Mutex/Lock). Kết quả từ hai chế độ hoạt động của phần mềm cho thấy rõ ràng tác động của việc đồng bộ hóa dữ liệu:</w:t>
+      </w:r>
+    </w:p>
+    <w:p>
+      <w:pPr>
+        <w:numPr>
+          <w:ilvl w:val="0"/>
+          <w:numId w:val="3"/>
+        </w:numPr>
+        <w:jc w:val="both"/>
+        <w:rPr>
+          <w:rFonts w:ascii="Times New Roman" w:hAnsi="Times New Roman" w:cs="Times New Roman"/>
+          <w:sz w:val="28"/>
+          <w:szCs w:val="28"/>
+          <w:lang w:val="vi-VN"/>
+        </w:rPr>
+      </w:pPr>
+      <w:r>
+        <w:rPr>
+          <w:rFonts w:ascii="Times New Roman" w:hAnsi="Times New Roman" w:cs="Times New Roman"/>
+          <w:b/>
+          <w:bCs/>
+          <w:sz w:val="28"/>
+          <w:szCs w:val="28"/>
+          <w:lang w:val="vi-VN"/>
+        </w:rPr>
+        <w:lastRenderedPageBreak/>
+        <w:t>Ở chế độ không sử dụng Khóa (Không Lock):</w:t>
+      </w:r>
+      <w:r>
+        <w:rPr>
+          <w:rFonts w:ascii="Times New Roman" w:hAnsi="Times New Roman" w:cs="Times New Roman"/>
+          <w:sz w:val="28"/>
+          <w:szCs w:val="28"/>
+          <w:lang w:val="vi-VN"/>
+        </w:rPr>
+        <w:t xml:space="preserve"> Khi nhiều luồng cùng truy cập và thay đổi biến chia sẻ, việc hệ điều hành ngắt ngữ cảnh (Context Switch) giữa chừng khiến các luồng đọc phải dữ liệu cũ, dẫn đến tình trạng ghi đè (Lost Update). Trong bài test thực nghiệm với 10 tiến trình, mỗi tiến trình lặp 100.000 vòng, dù thời gian thực thi rất nhanh (chỉ mất khoảng </w:t>
+      </w:r>
+      <w:r>
+        <w:rPr>
+          <w:rFonts w:ascii="Times New Roman" w:hAnsi="Times New Roman" w:cs="Times New Roman"/>
+          <w:b/>
+          <w:bCs/>
+          <w:sz w:val="28"/>
+          <w:szCs w:val="28"/>
+          <w:lang w:val="vi-VN"/>
+        </w:rPr>
+        <w:t>[Điền số]</w:t>
+      </w:r>
+      <w:r>
+        <w:rPr>
+          <w:rFonts w:ascii="Times New Roman" w:hAnsi="Times New Roman" w:cs="Times New Roman"/>
+          <w:sz w:val="28"/>
+          <w:szCs w:val="28"/>
+          <w:lang w:val="vi-VN"/>
+        </w:rPr>
+        <w:t xml:space="preserve"> ms), nhưng kết quả cuối cùng lại thất thoát nghiêm trọng (giá trị thực tế thấp hơn rất nhiều so với giá trị kỳ vọng là 1.000.000).</w:t>
+      </w:r>
+    </w:p>
+    <w:p>
+      <w:pPr>
+        <w:numPr>
+          <w:ilvl w:val="0"/>
+          <w:numId w:val="3"/>
+        </w:numPr>
+        <w:jc w:val="both"/>
+        <w:rPr>
+          <w:rFonts w:ascii="Times New Roman" w:hAnsi="Times New Roman" w:cs="Times New Roman"/>
+          <w:sz w:val="28"/>
+          <w:szCs w:val="28"/>
+          <w:lang w:val="vi-VN"/>
+        </w:rPr>
+      </w:pPr>
+      <w:r>
+        <w:rPr>
+          <w:rFonts w:ascii="Times New Roman" w:hAnsi="Times New Roman" w:cs="Times New Roman"/>
+          <w:b/>
+          <w:bCs/>
+          <w:sz w:val="28"/>
+          <w:szCs w:val="28"/>
+          <w:lang w:val="vi-VN"/>
+        </w:rPr>
+        <w:t>Ở chế độ sử dụng Khóa (Có Lock):</w:t>
+      </w:r>
+      <w:r>
+        <w:rPr>
+          <w:rFonts w:ascii="Times New Roman" w:hAnsi="Times New Roman" w:cs="Times New Roman"/>
+          <w:sz w:val="28"/>
+          <w:szCs w:val="28"/>
+          <w:lang w:val="vi-VN"/>
+        </w:rPr>
+        <w:t xml:space="preserve"> Khi áp dụng cơ chế khóa (sử dụng từ khóa lock trong C# tương đương với Mutex), tính toàn vẹn của dữ liệu được đảm bảo tuyệt đối. Chỉ một luồng được phép bước vào miền găng (critical section) tại một thời điểm. Dữ liệu đếm luôn đạt chính xác mức kỳ vọng 100%.</w:t>
+      </w:r>
+    </w:p>
+    <w:p>
+      <w:pPr>
+        <w:jc w:val="both"/>
+        <w:rPr>
+          <w:rFonts w:ascii="Times New Roman" w:hAnsi="Times New Roman" w:cs="Times New Roman"/>
+          <w:b/>
+          <w:bCs/>
+          <w:sz w:val="28"/>
+          <w:szCs w:val="28"/>
+          <w:lang w:val="vi-VN"/>
+        </w:rPr>
+      </w:pPr>
+      <w:r>
+        <w:rPr>
+          <w:rFonts w:ascii="Times New Roman" w:hAnsi="Times New Roman" w:cs="Times New Roman"/>
+          <w:b/>
+          <w:bCs/>
+          <w:sz w:val="28"/>
+          <w:szCs w:val="28"/>
+          <w:lang w:val="vi-VN"/>
+        </w:rPr>
+        <w:t>4.2. Bài toán đánh đổi (Trade-off) giữa Hiệu năng và Tính Toàn vẹn</w:t>
+      </w:r>
+    </w:p>
+    <w:p>
+      <w:pPr>
+        <w:jc w:val="both"/>
+        <w:rPr>
+          <w:rFonts w:ascii="Times New Roman" w:hAnsi="Times New Roman" w:cs="Times New Roman"/>
+          <w:sz w:val="28"/>
+          <w:szCs w:val="28"/>
+          <w:lang w:val="vi-VN"/>
+        </w:rPr>
+      </w:pPr>
+      <w:r>
+        <w:rPr>
+          <w:rFonts w:ascii="Times New Roman" w:hAnsi="Times New Roman" w:cs="Times New Roman"/>
+          <w:sz w:val="28"/>
+          <w:szCs w:val="28"/>
+          <w:lang w:val="vi-VN"/>
+        </w:rPr>
+        <w:t>Từ các số liệu thu thập được trong quá trình chạy thực nghiệm, nhóm nhận thấy sự đánh đổi tất yếu trong thiết kế Hệ điều hành:</w:t>
+      </w:r>
+    </w:p>
+    <w:p>
+      <w:pPr>
+        <w:numPr>
+          <w:ilvl w:val="0"/>
+          <w:numId w:val="4"/>
+        </w:numPr>
+        <w:jc w:val="both"/>
+        <w:rPr>
+          <w:rFonts w:ascii="Times New Roman" w:hAnsi="Times New Roman" w:cs="Times New Roman"/>
+          <w:sz w:val="28"/>
+          <w:szCs w:val="28"/>
+          <w:lang w:val="vi-VN"/>
+        </w:rPr>
+      </w:pPr>
+      <w:r>
+        <w:rPr>
+          <w:rFonts w:ascii="Times New Roman" w:hAnsi="Times New Roman" w:cs="Times New Roman"/>
+          <w:b/>
+          <w:bCs/>
+          <w:sz w:val="28"/>
+          <w:szCs w:val="28"/>
+          <w:lang w:val="vi-VN"/>
+        </w:rPr>
+        <w:t>Chi phí của sự an toàn (Overhead):</w:t>
+      </w:r>
+      <w:r>
+        <w:rPr>
+          <w:rFonts w:ascii="Times New Roman" w:hAnsi="Times New Roman" w:cs="Times New Roman"/>
+          <w:sz w:val="28"/>
+          <w:szCs w:val="28"/>
+          <w:lang w:val="vi-VN"/>
+        </w:rPr>
+        <w:t xml:space="preserve"> Việc sử dụng cơ chế đồng bộ hóa (Mutex) không phải là "miễn phí". Khi chạy mô phỏng có khóa, thời gian thực thi của CPU tăng lên đáng kể (mất</w:t>
+      </w:r>
+      <w:r>
+        <w:rPr>
+          <w:rFonts w:ascii="Times New Roman" w:hAnsi="Times New Roman" w:cs="Times New Roman"/>
+          <w:sz w:val="28"/>
+          <w:szCs w:val="28"/>
+          <w:lang w:val="vi-VN"/>
+        </w:rPr>
+        <w:t xml:space="preserve"> trung bình khoảng </w:t>
+      </w:r>
+      <w:r>
+        <w:rPr>
+          <w:rFonts w:ascii="Times New Roman" w:hAnsi="Times New Roman" w:cs="Times New Roman"/>
+          <w:b/>
+          <w:bCs/>
+          <w:sz w:val="28"/>
+          <w:szCs w:val="28"/>
+          <w:lang w:val="vi-VN"/>
+        </w:rPr>
+        <w:t>s</w:t>
+      </w:r>
+      <w:r>
+        <w:rPr>
+          <w:rFonts w:ascii="Times New Roman" w:hAnsi="Times New Roman" w:cs="Times New Roman"/>
+          <w:sz w:val="28"/>
+          <w:szCs w:val="28"/>
+          <w:lang w:val="vi-VN"/>
+        </w:rPr>
+        <w:t xml:space="preserve"> ms, chậm gấp </w:t>
+      </w:r>
+      <w:r>
+        <w:rPr>
+          <w:rFonts w:ascii="Times New Roman" w:hAnsi="Times New Roman" w:cs="Times New Roman"/>
+          <w:b/>
+          <w:bCs/>
+          <w:sz w:val="28"/>
+          <w:szCs w:val="28"/>
+          <w:lang w:val="vi-VN"/>
+        </w:rPr>
+        <w:t xml:space="preserve">4.97 </w:t>
+      </w:r>
+      <w:r>
+        <w:rPr>
+          <w:rFonts w:ascii="Times New Roman" w:hAnsi="Times New Roman" w:cs="Times New Roman"/>
+          <w:sz w:val="28"/>
+          <w:szCs w:val="28"/>
+          <w:lang w:val="vi-VN"/>
+        </w:rPr>
+        <w:t>lần so với không có khóa).</w:t>
+      </w:r>
+    </w:p>
+    <w:p>
+      <w:pPr>
+        <w:numPr>
+          <w:ilvl w:val="0"/>
+          <w:numId w:val="4"/>
+        </w:numPr>
+        <w:jc w:val="both"/>
+        <w:rPr>
+          <w:rFonts w:ascii="Times New Roman" w:hAnsi="Times New Roman" w:cs="Times New Roman"/>
+          <w:sz w:val="28"/>
+          <w:szCs w:val="28"/>
+          <w:lang w:val="vi-VN"/>
+        </w:rPr>
+      </w:pPr>
+      <w:r>
+        <w:rPr>
+          <w:rFonts w:ascii="Times New Roman" w:hAnsi="Times New Roman" w:cs="Times New Roman"/>
+          <w:b/>
+          <w:bCs/>
+          <w:sz w:val="28"/>
+          <w:szCs w:val="28"/>
+          <w:lang w:val="vi-VN"/>
+        </w:rPr>
+        <w:t>Nguyên nhân làm giảm hiệu năng:</w:t>
+      </w:r>
+      <w:r>
+        <w:rPr>
+          <w:rFonts w:ascii="Times New Roman" w:hAnsi="Times New Roman" w:cs="Times New Roman"/>
+          <w:sz w:val="28"/>
+          <w:szCs w:val="28"/>
+          <w:lang w:val="vi-VN"/>
+        </w:rPr>
+        <w:t xml:space="preserve"> Sự gia tăng thời gian này đến từ hai yếu tố cốt lõi: (1) Các tiến trình phải mất thời gian ở trạng thái chờ (waiting/blocking) để xin cấp phát khóa, và (2) Chi phí quản lý của hệ điều hành trong việc liên tục cấp quyền và thu hồi khóa sau mỗi vòng lặp.</w:t>
+      </w:r>
+    </w:p>
+    <w:p>
+      <w:pPr>
+        <w:jc w:val="both"/>
+        <w:rPr>
+          <w:rFonts w:ascii="Times New Roman" w:hAnsi="Times New Roman" w:cs="Times New Roman"/>
+          <w:sz w:val="28"/>
+          <w:szCs w:val="28"/>
+          <w:lang w:val="vi-VN"/>
+        </w:rPr>
+      </w:pPr>
     </w:p>
     <w:p>
       <w:pPr>
@@ -1163,6 +1464,7 @@
           <w:rFonts w:ascii="Times New Roman" w:hAnsi="Times New Roman" w:cs="Times New Roman"/>
           <w:sz w:val="28"/>
           <w:szCs w:val="28"/>
+          <w:lang w:val="vi-VN"/>
         </w:rPr>
       </w:pPr>
       <w:r>
@@ -1260,6 +1562,155 @@
 <file path=word/numbering.xml><?xml version="1.0" encoding="utf-8"?>
 <w:numbering xmlns:wpc="http://schemas.microsoft.com/office/word/2010/wordprocessingCanvas" xmlns:cx="http://schemas.microsoft.com/office/drawing/2014/chartex" xmlns:cx1="http://schemas.microsoft.com/office/drawing/2015/9/8/chartex" xmlns:cx2="http://schemas.microsoft.com/office/drawing/2015/10/21/chartex" xmlns:cx3="http://schemas.microsoft.com/office/drawing/2016/5/9/chartex" xmlns:cx4="http://schemas.microsoft.com/office/drawing/2016/5/10/chartex" xmlns:cx5="http://schemas.microsoft.com/office/drawing/2016/5/11/chartex" xmlns:cx6="http://schemas.microsoft.com/office/drawing/2016/5/12/chartex" xmlns:cx7="http://schemas.microsoft.com/office/drawing/2016/5/13/chartex" xmlns:cx8="http://schemas.microsoft.com/office/drawing/2016/5/14/chartex" xmlns:mc="http://schemas.openxmlformats.org/markup-compatibility/2006" xmlns:aink="http://schemas.microsoft.com/office/drawing/2016/ink" xmlns:am3d="http://schemas.microsoft.com/office/drawing/2017/model3d" xmlns:o="urn:schemas-microsoft-com:office:office" xmlns:oel="http://schemas.microsoft.com/office/2019/extlst" xmlns:r="http://schemas.openxmlformats.org/officeDocument/2006/relationships" xmlns:m="http://schemas.openxmlformats.org/officeDocument/2006/math" xmlns:v="urn:schemas-microsoft-com:vml" xmlns:wp14="http://schemas.microsoft.com/office/word/2010/wordprocessingDrawing" xmlns:wp="http://schemas.openxmlformats.org/drawingml/2006/wordprocessingDrawing" xmlns:w10="urn:schemas-microsoft-com:office:word" xmlns:w="http://schemas.openxmlformats.org/wordprocessingml/2006/main" xmlns:w14="http://schemas.microsoft.com/office/word/2010/wordml" xmlns:w15="http://schemas.microsoft.com/office/word/2012/wordml" xmlns:w16cex="http://schemas.microsoft.com/office/word/2018/wordml/cex" xmlns:w16cid="http://schemas.microsoft.com/office/word/2016/wordml/cid" xmlns:w16="http://schemas.microsoft.com/office/word/2018/wordml" xmlns:w16du="http://schemas.microsoft.com/office/word/2023/wordml/word16du" xmlns:w16sdtdh="http://schemas.microsoft.com/office/word/2020/wordml/sdtdatahash" xmlns:w16sdtfl="http://schemas.microsoft.com/office/word/2024/wordml/sdtformatlock" xmlns:w16se="http://schemas.microsoft.com/office/word/2015/wordml/symex" xmlns:wpg="http://schemas.microsoft.com/office/word/2010/wordprocessingGroup" xmlns:wpi="http://schemas.microsoft.com/office/word/2010/wordprocessingInk" xmlns:wne="http://schemas.microsoft.com/office/word/2006/wordml" xmlns:wps="http://schemas.microsoft.com/office/word/2010/wordprocessingShape" mc:Ignorable="w14 w15 w16se w16cid w16 w16cex w16sdtdh w16sdtfl w16du wp14">
   <w:abstractNum w:abstractNumId="0" w15:restartNumberingAfterBreak="0">
+    <w:nsid w:val="455176E7"/>
+    <w:multiLevelType w:val="multilevel"/>
+    <w:tmpl w:val="79B0BFD2"/>
+    <w:lvl w:ilvl="0">
+      <w:start w:val="1"/>
+      <w:numFmt w:val="bullet"/>
+      <w:lvlText w:val=""/>
+      <w:lvlJc w:val="left"/>
+      <w:pPr>
+        <w:tabs>
+          <w:tab w:val="num" w:pos="720"/>
+        </w:tabs>
+        <w:ind w:left="720" w:hanging="360"/>
+      </w:pPr>
+      <w:rPr>
+        <w:rFonts w:ascii="Symbol" w:hAnsi="Symbol" w:hint="default"/>
+        <w:sz w:val="20"/>
+      </w:rPr>
+    </w:lvl>
+    <w:lvl w:ilvl="1" w:tentative="1">
+      <w:start w:val="1"/>
+      <w:numFmt w:val="bullet"/>
+      <w:lvlText w:val="o"/>
+      <w:lvlJc w:val="left"/>
+      <w:pPr>
+        <w:tabs>
+          <w:tab w:val="num" w:pos="1440"/>
+        </w:tabs>
+        <w:ind w:left="1440" w:hanging="360"/>
+      </w:pPr>
+      <w:rPr>
+        <w:rFonts w:ascii="Courier New" w:hAnsi="Courier New" w:hint="default"/>
+        <w:sz w:val="20"/>
+      </w:rPr>
+    </w:lvl>
+    <w:lvl w:ilvl="2" w:tentative="1">
+      <w:start w:val="1"/>
+      <w:numFmt w:val="bullet"/>
+      <w:lvlText w:val=""/>
+      <w:lvlJc w:val="left"/>
+      <w:pPr>
+        <w:tabs>
+          <w:tab w:val="num" w:pos="2160"/>
+        </w:tabs>
+        <w:ind w:left="2160" w:hanging="360"/>
+      </w:pPr>
+      <w:rPr>
+        <w:rFonts w:ascii="Wingdings" w:hAnsi="Wingdings" w:hint="default"/>
+        <w:sz w:val="20"/>
+      </w:rPr>
+    </w:lvl>
+    <w:lvl w:ilvl="3" w:tentative="1">
+      <w:start w:val="1"/>
+      <w:numFmt w:val="bullet"/>
+      <w:lvlText w:val=""/>
+      <w:lvlJc w:val="left"/>
+      <w:pPr>
+        <w:tabs>
+          <w:tab w:val="num" w:pos="2880"/>
+        </w:tabs>
+        <w:ind w:left="2880" w:hanging="360"/>
+      </w:pPr>
+      <w:rPr>
+        <w:rFonts w:ascii="Wingdings" w:hAnsi="Wingdings" w:hint="default"/>
+        <w:sz w:val="20"/>
+      </w:rPr>
+    </w:lvl>
+    <w:lvl w:ilvl="4" w:tentative="1">
+      <w:start w:val="1"/>
+      <w:numFmt w:val="bullet"/>
+      <w:lvlText w:val=""/>
+      <w:lvlJc w:val="left"/>
+      <w:pPr>
+        <w:tabs>
+          <w:tab w:val="num" w:pos="3600"/>
+        </w:tabs>
+        <w:ind w:left="3600" w:hanging="360"/>
+      </w:pPr>
+      <w:rPr>
+        <w:rFonts w:ascii="Wingdings" w:hAnsi="Wingdings" w:hint="default"/>
+        <w:sz w:val="20"/>
+      </w:rPr>
+    </w:lvl>
+    <w:lvl w:ilvl="5" w:tentative="1">
+      <w:start w:val="1"/>
+      <w:numFmt w:val="bullet"/>
+      <w:lvlText w:val=""/>
+      <w:lvlJc w:val="left"/>
+      <w:pPr>
+        <w:tabs>
+          <w:tab w:val="num" w:pos="4320"/>
+        </w:tabs>
+        <w:ind w:left="4320" w:hanging="360"/>
+      </w:pPr>
+      <w:rPr>
+        <w:rFonts w:ascii="Wingdings" w:hAnsi="Wingdings" w:hint="default"/>
+        <w:sz w:val="20"/>
+      </w:rPr>
+    </w:lvl>
+    <w:lvl w:ilvl="6" w:tentative="1">
+      <w:start w:val="1"/>
+      <w:numFmt w:val="bullet"/>
+      <w:lvlText w:val=""/>
+      <w:lvlJc w:val="left"/>
+      <w:pPr>
+        <w:tabs>
+          <w:tab w:val="num" w:pos="5040"/>
+        </w:tabs>
+        <w:ind w:left="5040" w:hanging="360"/>
+      </w:pPr>
+      <w:rPr>
+        <w:rFonts w:ascii="Wingdings" w:hAnsi="Wingdings" w:hint="default"/>
+        <w:sz w:val="20"/>
+      </w:rPr>
+    </w:lvl>
+    <w:lvl w:ilvl="7" w:tentative="1">
+      <w:start w:val="1"/>
+      <w:numFmt w:val="bullet"/>
+      <w:lvlText w:val=""/>
+      <w:lvlJc w:val="left"/>
+      <w:pPr>
+        <w:tabs>
+          <w:tab w:val="num" w:pos="5760"/>
+        </w:tabs>
+        <w:ind w:left="5760" w:hanging="360"/>
+      </w:pPr>
+      <w:rPr>
+        <w:rFonts w:ascii="Wingdings" w:hAnsi="Wingdings" w:hint="default"/>
+        <w:sz w:val="20"/>
+      </w:rPr>
+    </w:lvl>
+    <w:lvl w:ilvl="8" w:tentative="1">
+      <w:start w:val="1"/>
+      <w:numFmt w:val="bullet"/>
+      <w:lvlText w:val=""/>
+      <w:lvlJc w:val="left"/>
+      <w:pPr>
+        <w:tabs>
+          <w:tab w:val="num" w:pos="6480"/>
+        </w:tabs>
+        <w:ind w:left="6480" w:hanging="360"/>
+      </w:pPr>
+      <w:rPr>
+        <w:rFonts w:ascii="Wingdings" w:hAnsi="Wingdings" w:hint="default"/>
+        <w:sz w:val="20"/>
+      </w:rPr>
+    </w:lvl>
+  </w:abstractNum>
+  <w:abstractNum w:abstractNumId="1" w15:restartNumberingAfterBreak="0">
     <w:nsid w:val="61011D4D"/>
     <w:multiLevelType w:val="multilevel"/>
     <w:tmpl w:val="8CA2850E"/>
@@ -1408,7 +1859,7 @@
       </w:rPr>
     </w:lvl>
   </w:abstractNum>
-  <w:abstractNum w:abstractNumId="1" w15:restartNumberingAfterBreak="0">
+  <w:abstractNum w:abstractNumId="2" w15:restartNumberingAfterBreak="0">
     <w:nsid w:val="6A760719"/>
     <w:multiLevelType w:val="multilevel"/>
     <w:tmpl w:val="18AAB61E"/>
@@ -1557,11 +2008,166 @@
       </w:rPr>
     </w:lvl>
   </w:abstractNum>
+  <w:abstractNum w:abstractNumId="3" w15:restartNumberingAfterBreak="0">
+    <w:nsid w:val="7A2833C5"/>
+    <w:multiLevelType w:val="multilevel"/>
+    <w:tmpl w:val="78606DE6"/>
+    <w:lvl w:ilvl="0">
+      <w:start w:val="1"/>
+      <w:numFmt w:val="bullet"/>
+      <w:lvlText w:val=""/>
+      <w:lvlJc w:val="left"/>
+      <w:pPr>
+        <w:tabs>
+          <w:tab w:val="num" w:pos="720"/>
+        </w:tabs>
+        <w:ind w:left="720" w:hanging="360"/>
+      </w:pPr>
+      <w:rPr>
+        <w:rFonts w:ascii="Symbol" w:hAnsi="Symbol" w:hint="default"/>
+        <w:sz w:val="20"/>
+      </w:rPr>
+    </w:lvl>
+    <w:lvl w:ilvl="1" w:tentative="1">
+      <w:start w:val="1"/>
+      <w:numFmt w:val="bullet"/>
+      <w:lvlText w:val="o"/>
+      <w:lvlJc w:val="left"/>
+      <w:pPr>
+        <w:tabs>
+          <w:tab w:val="num" w:pos="1440"/>
+        </w:tabs>
+        <w:ind w:left="1440" w:hanging="360"/>
+      </w:pPr>
+      <w:rPr>
+        <w:rFonts w:ascii="Courier New" w:hAnsi="Courier New" w:hint="default"/>
+        <w:sz w:val="20"/>
+      </w:rPr>
+    </w:lvl>
+    <w:lvl w:ilvl="2" w:tentative="1">
+      <w:start w:val="1"/>
+      <w:numFmt w:val="bullet"/>
+      <w:lvlText w:val=""/>
+      <w:lvlJc w:val="left"/>
+      <w:pPr>
+        <w:tabs>
+          <w:tab w:val="num" w:pos="2160"/>
+        </w:tabs>
+        <w:ind w:left="2160" w:hanging="360"/>
+      </w:pPr>
+      <w:rPr>
+        <w:rFonts w:ascii="Wingdings" w:hAnsi="Wingdings" w:hint="default"/>
+        <w:sz w:val="20"/>
+      </w:rPr>
+    </w:lvl>
+    <w:lvl w:ilvl="3" w:tentative="1">
+      <w:start w:val="1"/>
+      <w:numFmt w:val="bullet"/>
+      <w:lvlText w:val=""/>
+      <w:lvlJc w:val="left"/>
+      <w:pPr>
+        <w:tabs>
+          <w:tab w:val="num" w:pos="2880"/>
+        </w:tabs>
+        <w:ind w:left="2880" w:hanging="360"/>
+      </w:pPr>
+      <w:rPr>
+        <w:rFonts w:ascii="Wingdings" w:hAnsi="Wingdings" w:hint="default"/>
+        <w:sz w:val="20"/>
+      </w:rPr>
+    </w:lvl>
+    <w:lvl w:ilvl="4" w:tentative="1">
+      <w:start w:val="1"/>
+      <w:numFmt w:val="bullet"/>
+      <w:lvlText w:val=""/>
+      <w:lvlJc w:val="left"/>
+      <w:pPr>
+        <w:tabs>
+          <w:tab w:val="num" w:pos="3600"/>
+        </w:tabs>
+        <w:ind w:left="3600" w:hanging="360"/>
+      </w:pPr>
+      <w:rPr>
+        <w:rFonts w:ascii="Wingdings" w:hAnsi="Wingdings" w:hint="default"/>
+        <w:sz w:val="20"/>
+      </w:rPr>
+    </w:lvl>
+    <w:lvl w:ilvl="5" w:tentative="1">
+      <w:start w:val="1"/>
+      <w:numFmt w:val="bullet"/>
+      <w:lvlText w:val=""/>
+      <w:lvlJc w:val="left"/>
+      <w:pPr>
+        <w:tabs>
+          <w:tab w:val="num" w:pos="4320"/>
+        </w:tabs>
+        <w:ind w:left="4320" w:hanging="360"/>
+      </w:pPr>
+      <w:rPr>
+        <w:rFonts w:ascii="Wingdings" w:hAnsi="Wingdings" w:hint="default"/>
+        <w:sz w:val="20"/>
+      </w:rPr>
+    </w:lvl>
+    <w:lvl w:ilvl="6" w:tentative="1">
+      <w:start w:val="1"/>
+      <w:numFmt w:val="bullet"/>
+      <w:lvlText w:val=""/>
+      <w:lvlJc w:val="left"/>
+      <w:pPr>
+        <w:tabs>
+          <w:tab w:val="num" w:pos="5040"/>
+        </w:tabs>
+        <w:ind w:left="5040" w:hanging="360"/>
+      </w:pPr>
+      <w:rPr>
+        <w:rFonts w:ascii="Wingdings" w:hAnsi="Wingdings" w:hint="default"/>
+        <w:sz w:val="20"/>
+      </w:rPr>
+    </w:lvl>
+    <w:lvl w:ilvl="7" w:tentative="1">
+      <w:start w:val="1"/>
+      <w:numFmt w:val="bullet"/>
+      <w:lvlText w:val=""/>
+      <w:lvlJc w:val="left"/>
+      <w:pPr>
+        <w:tabs>
+          <w:tab w:val="num" w:pos="5760"/>
+        </w:tabs>
+        <w:ind w:left="5760" w:hanging="360"/>
+      </w:pPr>
+      <w:rPr>
+        <w:rFonts w:ascii="Wingdings" w:hAnsi="Wingdings" w:hint="default"/>
+        <w:sz w:val="20"/>
+      </w:rPr>
+    </w:lvl>
+    <w:lvl w:ilvl="8" w:tentative="1">
+      <w:start w:val="1"/>
+      <w:numFmt w:val="bullet"/>
+      <w:lvlText w:val=""/>
+      <w:lvlJc w:val="left"/>
+      <w:pPr>
+        <w:tabs>
+          <w:tab w:val="num" w:pos="6480"/>
+        </w:tabs>
+        <w:ind w:left="6480" w:hanging="360"/>
+      </w:pPr>
+      <w:rPr>
+        <w:rFonts w:ascii="Wingdings" w:hAnsi="Wingdings" w:hint="default"/>
+        <w:sz w:val="20"/>
+      </w:rPr>
+    </w:lvl>
+  </w:abstractNum>
   <w:num w:numId="1" w16cid:durableId="1846241236">
+    <w:abstractNumId w:val="1"/>
+  </w:num>
+  <w:num w:numId="2" w16cid:durableId="339629435">
+    <w:abstractNumId w:val="2"/>
+  </w:num>
+  <w:num w:numId="3" w16cid:durableId="821507134">
     <w:abstractNumId w:val="0"/>
   </w:num>
-  <w:num w:numId="2" w16cid:durableId="339629435">
-    <w:abstractNumId w:val="1"/>
+  <w:num w:numId="4" w16cid:durableId="1333410414">
+    <w:abstractNumId w:val="3"/>
   </w:num>
 </w:numbering>
 </file>
@@ -1963,15 +2569,15 @@
     <w:lsdException w:name="Unresolved Mention" w:semiHidden="1" w:unhideWhenUsed="1"/>
     <w:lsdException w:name="Smart Link" w:semiHidden="1" w:unhideWhenUsed="1"/>
   </w:latentStyles>
-  <w:style w:type="paragraph" w:default="1" w:styleId="Normal">
+  <w:style w:type="paragraph" w:default="1" w:styleId="Binhthng">
     <w:name w:val="Normal"/>
     <w:qFormat/>
   </w:style>
-  <w:style w:type="paragraph" w:styleId="Heading1">
+  <w:style w:type="paragraph" w:styleId="u1">
     <w:name w:val="heading 1"/>
-    <w:basedOn w:val="Normal"/>
-    <w:next w:val="Normal"/>
-    <w:link w:val="Heading1Char"/>
+    <w:basedOn w:val="Binhthng"/>
+    <w:next w:val="Binhthng"/>
+    <w:link w:val="u1Char"/>
     <w:uiPriority w:val="9"/>
     <w:qFormat/>
     <w:rsid w:val="00D77801"/>
@@ -1988,11 +2594,11 @@
       <w:szCs w:val="40"/>
     </w:rPr>
   </w:style>
-  <w:style w:type="paragraph" w:styleId="Heading2">
+  <w:style w:type="paragraph" w:styleId="u2">
     <w:name w:val="heading 2"/>
-    <w:basedOn w:val="Normal"/>
-    <w:next w:val="Normal"/>
-    <w:link w:val="Heading2Char"/>
+    <w:basedOn w:val="Binhthng"/>
+    <w:next w:val="Binhthng"/>
+    <w:link w:val="u2Char"/>
     <w:uiPriority w:val="9"/>
     <w:semiHidden/>
     <w:unhideWhenUsed/>
@@ -2011,11 +2617,11 @@
       <w:szCs w:val="32"/>
     </w:rPr>
   </w:style>
-  <w:style w:type="paragraph" w:styleId="Heading3">
+  <w:style w:type="paragraph" w:styleId="u3">
     <w:name w:val="heading 3"/>
-    <w:basedOn w:val="Normal"/>
-    <w:next w:val="Normal"/>
-    <w:link w:val="Heading3Char"/>
+    <w:basedOn w:val="Binhthng"/>
+    <w:next w:val="Binhthng"/>
+    <w:link w:val="u3Char"/>
     <w:uiPriority w:val="9"/>
     <w:semiHidden/>
     <w:unhideWhenUsed/>
@@ -2034,11 +2640,11 @@
       <w:szCs w:val="28"/>
     </w:rPr>
   </w:style>
-  <w:style w:type="paragraph" w:styleId="Heading4">
+  <w:style w:type="paragraph" w:styleId="u4">
     <w:name w:val="heading 4"/>
-    <w:basedOn w:val="Normal"/>
-    <w:next w:val="Normal"/>
-    <w:link w:val="Heading4Char"/>
+    <w:basedOn w:val="Binhthng"/>
+    <w:next w:val="Binhthng"/>
+    <w:link w:val="u4Char"/>
     <w:uiPriority w:val="9"/>
     <w:semiHidden/>
     <w:unhideWhenUsed/>
@@ -2057,11 +2663,11 @@
       <w:color w:val="2F5496" w:themeColor="accent1" w:themeShade="BF"/>
     </w:rPr>
   </w:style>
-  <w:style w:type="paragraph" w:styleId="Heading5">
+  <w:style w:type="paragraph" w:styleId="u5">
     <w:name w:val="heading 5"/>
-    <w:basedOn w:val="Normal"/>
-    <w:next w:val="Normal"/>
-    <w:link w:val="Heading5Char"/>
+    <w:basedOn w:val="Binhthng"/>
+    <w:next w:val="Binhthng"/>
+    <w:link w:val="u5Char"/>
     <w:uiPriority w:val="9"/>
     <w:semiHidden/>
     <w:unhideWhenUsed/>
@@ -2078,11 +2684,11 @@
       <w:color w:val="2F5496" w:themeColor="accent1" w:themeShade="BF"/>
     </w:rPr>
   </w:style>
-  <w:style w:type="paragraph" w:styleId="Heading6">
+  <w:style w:type="paragraph" w:styleId="u6">
     <w:name w:val="heading 6"/>
-    <w:basedOn w:val="Normal"/>
-    <w:next w:val="Normal"/>
-    <w:link w:val="Heading6Char"/>
+    <w:basedOn w:val="Binhthng"/>
+    <w:next w:val="Binhthng"/>
+    <w:link w:val="u6Char"/>
     <w:uiPriority w:val="9"/>
     <w:semiHidden/>
     <w:unhideWhenUsed/>
@@ -2101,11 +2707,11 @@
       <w:color w:val="595959" w:themeColor="text1" w:themeTint="A6"/>
     </w:rPr>
   </w:style>
-  <w:style w:type="paragraph" w:styleId="Heading7">
+  <w:style w:type="paragraph" w:styleId="u7">
     <w:name w:val="heading 7"/>
-    <w:basedOn w:val="Normal"/>
-    <w:next w:val="Normal"/>
-    <w:link w:val="Heading7Char"/>
+    <w:basedOn w:val="Binhthng"/>
+    <w:next w:val="Binhthng"/>
+    <w:link w:val="u7Char"/>
     <w:uiPriority w:val="9"/>
     <w:semiHidden/>
     <w:unhideWhenUsed/>
@@ -2122,11 +2728,11 @@
       <w:color w:val="595959" w:themeColor="text1" w:themeTint="A6"/>
     </w:rPr>
   </w:style>
-  <w:style w:type="paragraph" w:styleId="Heading8">
+  <w:style w:type="paragraph" w:styleId="u8">
     <w:name w:val="heading 8"/>
-    <w:basedOn w:val="Normal"/>
-    <w:next w:val="Normal"/>
-    <w:link w:val="Heading8Char"/>
+    <w:basedOn w:val="Binhthng"/>
+    <w:next w:val="Binhthng"/>
+    <w:link w:val="u8Char"/>
     <w:uiPriority w:val="9"/>
     <w:semiHidden/>
     <w:unhideWhenUsed/>
@@ -2145,11 +2751,11 @@
       <w:color w:val="272727" w:themeColor="text1" w:themeTint="D8"/>
     </w:rPr>
   </w:style>
-  <w:style w:type="paragraph" w:styleId="Heading9">
+  <w:style w:type="paragraph" w:styleId="u9">
     <w:name w:val="heading 9"/>
-    <w:basedOn w:val="Normal"/>
-    <w:next w:val="Normal"/>
-    <w:link w:val="Heading9Char"/>
+    <w:basedOn w:val="Binhthng"/>
+    <w:next w:val="Binhthng"/>
+    <w:link w:val="u9Char"/>
     <w:uiPriority w:val="9"/>
     <w:semiHidden/>
     <w:unhideWhenUsed/>
@@ -2166,12 +2772,12 @@
       <w:color w:val="272727" w:themeColor="text1" w:themeTint="D8"/>
     </w:rPr>
   </w:style>
-  <w:style w:type="character" w:default="1" w:styleId="DefaultParagraphFont">
+  <w:style w:type="character" w:default="1" w:styleId="Phngmcinhcuaoanvn">
     <w:name w:val="Default Paragraph Font"/>
     <w:uiPriority w:val="1"/>
     <w:unhideWhenUsed/>
   </w:style>
-  <w:style w:type="table" w:default="1" w:styleId="TableNormal">
+  <w:style w:type="table" w:default="1" w:styleId="BangThngthng">
     <w:name w:val="Normal Table"/>
     <w:uiPriority w:val="99"/>
     <w:semiHidden/>
@@ -2186,16 +2792,16 @@
       </w:tblCellMar>
     </w:tblPr>
   </w:style>
-  <w:style w:type="numbering" w:default="1" w:styleId="NoList">
+  <w:style w:type="numbering" w:default="1" w:styleId="Khngco">
     <w:name w:val="No List"/>
     <w:uiPriority w:val="99"/>
     <w:semiHidden/>
     <w:unhideWhenUsed/>
   </w:style>
-  <w:style w:type="character" w:customStyle="1" w:styleId="Heading1Char">
-    <w:name w:val="Heading 1 Char"/>
-    <w:basedOn w:val="DefaultParagraphFont"/>
-    <w:link w:val="Heading1"/>
+  <w:style w:type="character" w:customStyle="1" w:styleId="u1Char">
+    <w:name w:val="Đầu đề 1 Char"/>
+    <w:basedOn w:val="Phngmcinhcuaoanvn"/>
+    <w:link w:val="u1"/>
     <w:uiPriority w:val="9"/>
     <w:rsid w:val="00D77801"/>
     <w:rPr>
@@ -2205,10 +2811,10 @@
       <w:szCs w:val="40"/>
     </w:rPr>
   </w:style>
-  <w:style w:type="character" w:customStyle="1" w:styleId="Heading2Char">
-    <w:name w:val="Heading 2 Char"/>
-    <w:basedOn w:val="DefaultParagraphFont"/>
-    <w:link w:val="Heading2"/>
+  <w:style w:type="character" w:customStyle="1" w:styleId="u2Char">
+    <w:name w:val="Đầu đề 2 Char"/>
+    <w:basedOn w:val="Phngmcinhcuaoanvn"/>
+    <w:link w:val="u2"/>
     <w:uiPriority w:val="9"/>
     <w:semiHidden/>
     <w:rsid w:val="00D77801"/>
@@ -2219,10 +2825,10 @@
       <w:szCs w:val="32"/>
     </w:rPr>
   </w:style>
-  <w:style w:type="character" w:customStyle="1" w:styleId="Heading3Char">
-    <w:name w:val="Heading 3 Char"/>
-    <w:basedOn w:val="DefaultParagraphFont"/>
-    <w:link w:val="Heading3"/>
+  <w:style w:type="character" w:customStyle="1" w:styleId="u3Char">
+    <w:name w:val="Đầu đề 3 Char"/>
+    <w:basedOn w:val="Phngmcinhcuaoanvn"/>
+    <w:link w:val="u3"/>
     <w:uiPriority w:val="9"/>
     <w:semiHidden/>
     <w:rsid w:val="00D77801"/>
@@ -2233,10 +2839,10 @@
       <w:szCs w:val="28"/>
     </w:rPr>
   </w:style>
-  <w:style w:type="character" w:customStyle="1" w:styleId="Heading4Char">
-    <w:name w:val="Heading 4 Char"/>
-    <w:basedOn w:val="DefaultParagraphFont"/>
-    <w:link w:val="Heading4"/>
+  <w:style w:type="character" w:customStyle="1" w:styleId="u4Char">
+    <w:name w:val="Đầu đề 4 Char"/>
+    <w:basedOn w:val="Phngmcinhcuaoanvn"/>
+    <w:link w:val="u4"/>
     <w:uiPriority w:val="9"/>
     <w:semiHidden/>
     <w:rsid w:val="00D77801"/>
@@ -2247,10 +2853,10 @@
       <w:color w:val="2F5496" w:themeColor="accent1" w:themeShade="BF"/>
     </w:rPr>
   </w:style>
-  <w:style w:type="character" w:customStyle="1" w:styleId="Heading5Char">
-    <w:name w:val="Heading 5 Char"/>
-    <w:basedOn w:val="DefaultParagraphFont"/>
-    <w:link w:val="Heading5"/>
+  <w:style w:type="character" w:customStyle="1" w:styleId="u5Char">
+    <w:name w:val="Đầu đề 5 Char"/>
+    <w:basedOn w:val="Phngmcinhcuaoanvn"/>
+    <w:link w:val="u5"/>
     <w:uiPriority w:val="9"/>
     <w:semiHidden/>
     <w:rsid w:val="00D77801"/>
@@ -2259,10 +2865,10 @@
       <w:color w:val="2F5496" w:themeColor="accent1" w:themeShade="BF"/>
     </w:rPr>
   </w:style>
-  <w:style w:type="character" w:customStyle="1" w:styleId="Heading6Char">
-    <w:name w:val="Heading 6 Char"/>
-    <w:basedOn w:val="DefaultParagraphFont"/>
-    <w:link w:val="Heading6"/>
+  <w:style w:type="character" w:customStyle="1" w:styleId="u6Char">
+    <w:name w:val="Đầu đề 6 Char"/>
+    <w:basedOn w:val="Phngmcinhcuaoanvn"/>
+    <w:link w:val="u6"/>
     <w:uiPriority w:val="9"/>
     <w:semiHidden/>
     <w:rsid w:val="00D77801"/>
@@ -2273,10 +2879,10 @@
       <w:color w:val="595959" w:themeColor="text1" w:themeTint="A6"/>
     </w:rPr>
   </w:style>
-  <w:style w:type="character" w:customStyle="1" w:styleId="Heading7Char">
-    <w:name w:val="Heading 7 Char"/>
-    <w:basedOn w:val="DefaultParagraphFont"/>
-    <w:link w:val="Heading7"/>
+  <w:style w:type="character" w:customStyle="1" w:styleId="u7Char">
+    <w:name w:val="Đầu đề 7 Char"/>
+    <w:basedOn w:val="Phngmcinhcuaoanvn"/>
+    <w:link w:val="u7"/>
     <w:uiPriority w:val="9"/>
     <w:semiHidden/>
     <w:rsid w:val="00D77801"/>
@@ -2285,10 +2891,10 @@
       <w:color w:val="595959" w:themeColor="text1" w:themeTint="A6"/>
     </w:rPr>
   </w:style>
-  <w:style w:type="character" w:customStyle="1" w:styleId="Heading8Char">
-    <w:name w:val="Heading 8 Char"/>
-    <w:basedOn w:val="DefaultParagraphFont"/>
-    <w:link w:val="Heading8"/>
+  <w:style w:type="character" w:customStyle="1" w:styleId="u8Char">
+    <w:name w:val="Đầu đề 8 Char"/>
+    <w:basedOn w:val="Phngmcinhcuaoanvn"/>
+    <w:link w:val="u8"/>
     <w:uiPriority w:val="9"/>
     <w:semiHidden/>
     <w:rsid w:val="00D77801"/>
@@ -2299,10 +2905,10 @@
       <w:color w:val="272727" w:themeColor="text1" w:themeTint="D8"/>
     </w:rPr>
   </w:style>
-  <w:style w:type="character" w:customStyle="1" w:styleId="Heading9Char">
-    <w:name w:val="Heading 9 Char"/>
-    <w:basedOn w:val="DefaultParagraphFont"/>
-    <w:link w:val="Heading9"/>
+  <w:style w:type="character" w:customStyle="1" w:styleId="u9Char">
+    <w:name w:val="Đầu đề 9 Char"/>
+    <w:basedOn w:val="Phngmcinhcuaoanvn"/>
+    <w:link w:val="u9"/>
     <w:uiPriority w:val="9"/>
     <w:semiHidden/>
     <w:rsid w:val="00D77801"/>
@@ -2311,11 +2917,11 @@
       <w:color w:val="272727" w:themeColor="text1" w:themeTint="D8"/>
     </w:rPr>
   </w:style>
-  <w:style w:type="paragraph" w:styleId="Title">
+  <w:style w:type="paragraph" w:styleId="Tiu">
     <w:name w:val="Title"/>
-    <w:basedOn w:val="Normal"/>
-    <w:next w:val="Normal"/>
-    <w:link w:val="TitleChar"/>
+    <w:basedOn w:val="Binhthng"/>
+    <w:next w:val="Binhthng"/>
+    <w:link w:val="TiuChar"/>
     <w:uiPriority w:val="10"/>
     <w:qFormat/>
     <w:rsid w:val="00D77801"/>
@@ -2331,10 +2937,10 @@
       <w:szCs w:val="56"/>
     </w:rPr>
   </w:style>
-  <w:style w:type="character" w:customStyle="1" w:styleId="TitleChar">
-    <w:name w:val="Title Char"/>
-    <w:basedOn w:val="DefaultParagraphFont"/>
-    <w:link w:val="Title"/>
+  <w:style w:type="character" w:customStyle="1" w:styleId="TiuChar">
+    <w:name w:val="Tiêu đề Char"/>
+    <w:basedOn w:val="Phngmcinhcuaoanvn"/>
+    <w:link w:val="Tiu"/>
     <w:uiPriority w:val="10"/>
     <w:rsid w:val="00D77801"/>
     <w:rPr>
@@ -2345,11 +2951,11 @@
       <w:szCs w:val="56"/>
     </w:rPr>
   </w:style>
-  <w:style w:type="paragraph" w:styleId="Subtitle">
+  <w:style w:type="paragraph" w:styleId="Tiuphu">
     <w:name w:val="Subtitle"/>
-    <w:basedOn w:val="Normal"/>
-    <w:next w:val="Normal"/>
-    <w:link w:val="SubtitleChar"/>
+    <w:basedOn w:val="Binhthng"/>
+    <w:next w:val="Binhthng"/>
+    <w:link w:val="TiuphuChar"/>
     <w:uiPriority w:val="11"/>
     <w:qFormat/>
     <w:rsid w:val="00D77801"/>
@@ -2366,10 +2972,10 @@
       <w:szCs w:val="28"/>
     </w:rPr>
   </w:style>
-  <w:style w:type="character" w:customStyle="1" w:styleId="SubtitleChar">
-    <w:name w:val="Subtitle Char"/>
-    <w:basedOn w:val="DefaultParagraphFont"/>
-    <w:link w:val="Subtitle"/>
+  <w:style w:type="character" w:customStyle="1" w:styleId="TiuphuChar">
+    <w:name w:val="Tiêu đề phụ Char"/>
+    <w:basedOn w:val="Phngmcinhcuaoanvn"/>
+    <w:link w:val="Tiuphu"/>
     <w:uiPriority w:val="11"/>
     <w:rsid w:val="00D77801"/>
     <w:rPr>
@@ -2380,11 +2986,11 @@
       <w:szCs w:val="28"/>
     </w:rPr>
   </w:style>
-  <w:style w:type="paragraph" w:styleId="Quote">
+  <w:style w:type="paragraph" w:styleId="Litrichdn">
     <w:name w:val="Quote"/>
-    <w:basedOn w:val="Normal"/>
-    <w:next w:val="Normal"/>
-    <w:link w:val="QuoteChar"/>
+    <w:basedOn w:val="Binhthng"/>
+    <w:next w:val="Binhthng"/>
+    <w:link w:val="LitrichdnChar"/>
     <w:uiPriority w:val="29"/>
     <w:qFormat/>
     <w:rsid w:val="00D77801"/>
@@ -2398,10 +3004,10 @@
       <w:color w:val="404040" w:themeColor="text1" w:themeTint="BF"/>
     </w:rPr>
   </w:style>
-  <w:style w:type="character" w:customStyle="1" w:styleId="QuoteChar">
-    <w:name w:val="Quote Char"/>
-    <w:basedOn w:val="DefaultParagraphFont"/>
-    <w:link w:val="Quote"/>
+  <w:style w:type="character" w:customStyle="1" w:styleId="LitrichdnChar">
+    <w:name w:val="Lời trích dẫn Char"/>
+    <w:basedOn w:val="Phngmcinhcuaoanvn"/>
+    <w:link w:val="Litrichdn"/>
     <w:uiPriority w:val="29"/>
     <w:rsid w:val="00D77801"/>
     <w:rPr>
@@ -2410,9 +3016,9 @@
       <w:color w:val="404040" w:themeColor="text1" w:themeTint="BF"/>
     </w:rPr>
   </w:style>
-  <w:style w:type="paragraph" w:styleId="ListParagraph">
+  <w:style w:type="paragraph" w:styleId="oancuaDanhsach">
     <w:name w:val="List Paragraph"/>
-    <w:basedOn w:val="Normal"/>
+    <w:basedOn w:val="Binhthng"/>
     <w:uiPriority w:val="34"/>
     <w:qFormat/>
     <w:rsid w:val="00D77801"/>
@@ -2421,9 +3027,9 @@
       <w:contextualSpacing/>
     </w:pPr>
   </w:style>
-  <w:style w:type="character" w:styleId="IntenseEmphasis">
+  <w:style w:type="character" w:styleId="NhnmnhThm">
     <w:name w:val="Intense Emphasis"/>
-    <w:basedOn w:val="DefaultParagraphFont"/>
+    <w:basedOn w:val="Phngmcinhcuaoanvn"/>
     <w:uiPriority w:val="21"/>
     <w:qFormat/>
     <w:rsid w:val="00D77801"/>
@@ -2433,11 +3039,11 @@
       <w:color w:val="2F5496" w:themeColor="accent1" w:themeShade="BF"/>
     </w:rPr>
   </w:style>
-  <w:style w:type="paragraph" w:styleId="IntenseQuote">
+  <w:style w:type="paragraph" w:styleId="Nhaykepm">
     <w:name w:val="Intense Quote"/>
-    <w:basedOn w:val="Normal"/>
-    <w:next w:val="Normal"/>
-    <w:link w:val="IntenseQuoteChar"/>
+    <w:basedOn w:val="Binhthng"/>
+    <w:next w:val="Binhthng"/>
+    <w:link w:val="NhaykepmChar"/>
     <w:uiPriority w:val="30"/>
     <w:qFormat/>
     <w:rsid w:val="00D77801"/>
@@ -2456,10 +3062,10 @@
       <w:color w:val="2F5496" w:themeColor="accent1" w:themeShade="BF"/>
     </w:rPr>
   </w:style>
-  <w:style w:type="character" w:customStyle="1" w:styleId="IntenseQuoteChar">
-    <w:name w:val="Intense Quote Char"/>
-    <w:basedOn w:val="DefaultParagraphFont"/>
-    <w:link w:val="IntenseQuote"/>
+  <w:style w:type="character" w:customStyle="1" w:styleId="NhaykepmChar">
+    <w:name w:val="Nháy kép Đậm Char"/>
+    <w:basedOn w:val="Phngmcinhcuaoanvn"/>
+    <w:link w:val="Nhaykepm"/>
     <w:uiPriority w:val="30"/>
     <w:rsid w:val="00D77801"/>
     <w:rPr>
@@ -2468,9 +3074,9 @@
       <w:color w:val="2F5496" w:themeColor="accent1" w:themeShade="BF"/>
     </w:rPr>
   </w:style>
-  <w:style w:type="character" w:styleId="IntenseReference">
+  <w:style w:type="character" w:styleId="ThamchiuNhnmnh">
     <w:name w:val="Intense Reference"/>
-    <w:basedOn w:val="DefaultParagraphFont"/>
+    <w:basedOn w:val="Phngmcinhcuaoanvn"/>
     <w:uiPriority w:val="32"/>
     <w:qFormat/>
     <w:rsid w:val="00D77801"/>

</xml_diff>